<commit_message>
Update modern firmware guide.
</commit_message>
<xml_diff>
--- a/Ifremer-isms-documentation/Ifremer_2026_ISMS_Operation.docx
+++ b/Ifremer-isms-documentation/Ifremer_2026_ISMS_Operation.docx
@@ -13,13 +13,13 @@
         <w:rPr>
           <w:rStyle w:val="Heading1Char"/>
         </w:rPr>
-        <w:t xml:space="preserve">Ifremer 2026 ISMS </w:t>
+        <w:t>Ifremer 2026 ISMS Operation</w:t>
       </w:r>
       <w:r>
         <w:rPr>
           <w:rStyle w:val="Heading1Char"/>
         </w:rPr>
-        <w:t>Operation</w:t>
+        <w:t xml:space="preserve"> with Legacy-Compatible firmware</w:t>
       </w:r>
       <w:r>
         <w:rPr>
@@ -69,7 +69,19 @@
         <w:rPr>
           <w:rFonts w:ascii="Times New Roman" w:hAnsi="Times New Roman" w:cs="Times New Roman"/>
         </w:rPr>
-        <w:t xml:space="preserve">. The ISMS firmware documented here closely follows the previous ISMS versions command format with </w:t>
+        <w:t>. The ISMS firmware documented here closely follows the previous ISMS versions command</w:t>
+      </w:r>
+      <w:r>
+        <w:rPr>
+          <w:rFonts w:ascii="Times New Roman" w:hAnsi="Times New Roman" w:cs="Times New Roman"/>
+        </w:rPr>
+        <w:t>/response</w:t>
+      </w:r>
+      <w:r>
+        <w:rPr>
+          <w:rFonts w:ascii="Times New Roman" w:hAnsi="Times New Roman" w:cs="Times New Roman"/>
+        </w:rPr>
+        <w:t xml:space="preserve"> format with </w:t>
       </w:r>
       <w:r>
         <w:rPr>
@@ -338,6 +350,12 @@
           <w:rFonts w:ascii="Times New Roman" w:hAnsi="Times New Roman" w:cs="Times New Roman"/>
         </w:rPr>
         <w:t xml:space="preserve"> (</w:t>
+      </w:r>
+      <w:r>
+        <w:rPr>
+          <w:rFonts w:ascii="Times New Roman" w:hAnsi="Times New Roman" w:cs="Times New Roman"/>
+        </w:rPr>
+        <w:t xml:space="preserve">Serial Studio, </w:t>
       </w:r>
       <w:r>
         <w:rPr>
@@ -1894,8 +1912,13 @@
         <w:rPr>
           <w:noProof/>
         </w:rPr>
-        <w:pict w14:anchorId="2DD8BFA3">
-          <v:rect id="_x0000_i1028" alt="" style="width:468pt;height:.05pt;mso-width-percent:0;mso-height-percent:0;mso-width-percent:0;mso-height-percent:0" o:hralign="center" o:hrstd="t" o:hr="t" fillcolor="#a0a0a0" stroked="f"/>
+      </w:r>
+      <w:r>
+        <w:pict w14:anchorId="6A538756">
+          <v:rect id="Horizontal Line 1" o:spid="_x0000_s1029" style="width:468pt;height:.05pt;visibility:visible;mso-wrap-style:square;mso-left-percent:-10001;mso-top-percent:-10001;mso-position-horizontal:absolute;mso-position-horizontal-relative:char;mso-position-vertical:absolute;mso-position-vertical-relative:line;mso-left-percent:-10001;mso-top-percent:-10001;v-text-anchor:top" o:gfxdata="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" filled="f">
+            <o:lock v:ext="edit" rotation="t" aspectratio="t" verticies="t" text="t" shapetype="t"/>
+            <w10:anchorlock/>
+          </v:rect>
         </w:pict>
       </w:r>
     </w:p>
@@ -2265,8 +2288,13 @@
         <w:rPr>
           <w:noProof/>
         </w:rPr>
-        <w:pict w14:anchorId="29C59A95">
-          <v:rect id="_x0000_i1027" alt="" style="width:468pt;height:.05pt;mso-width-percent:0;mso-height-percent:0;mso-width-percent:0;mso-height-percent:0" o:hralign="center" o:hrstd="t" o:hr="t" fillcolor="#a0a0a0" stroked="f"/>
+      </w:r>
+      <w:r>
+        <w:pict w14:anchorId="76E16742">
+          <v:rect id="Horizontal Line 2" o:spid="_x0000_s1028" style="width:468pt;height:.05pt;visibility:visible;mso-wrap-style:square;mso-left-percent:-10001;mso-top-percent:-10001;mso-position-horizontal:absolute;mso-position-horizontal-relative:char;mso-position-vertical:absolute;mso-position-vertical-relative:line;mso-left-percent:-10001;mso-top-percent:-10001;v-text-anchor:top" o:gfxdata="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" filled="f">
+            <o:lock v:ext="edit" rotation="t" aspectratio="t" verticies="t" text="t" shapetype="t"/>
+            <w10:anchorlock/>
+          </v:rect>
         </w:pict>
       </w:r>
     </w:p>
@@ -2746,8 +2774,13 @@
         <w:rPr>
           <w:noProof/>
         </w:rPr>
-        <w:pict w14:anchorId="60A4278A">
-          <v:rect id="_x0000_i1026" alt="" style="width:468pt;height:.05pt;mso-width-percent:0;mso-height-percent:0;mso-width-percent:0;mso-height-percent:0" o:hralign="center" o:hrstd="t" o:hr="t" fillcolor="#a0a0a0" stroked="f"/>
+      </w:r>
+      <w:r>
+        <w:pict w14:anchorId="1759FDD9">
+          <v:rect id="Horizontal Line 3" o:spid="_x0000_s1027" style="width:468pt;height:.05pt;visibility:visible;mso-wrap-style:square;mso-left-percent:-10001;mso-top-percent:-10001;mso-position-horizontal:absolute;mso-position-horizontal-relative:char;mso-position-vertical:absolute;mso-position-vertical-relative:line;mso-left-percent:-10001;mso-top-percent:-10001;v-text-anchor:top" o:gfxdata="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" filled="f">
+            <o:lock v:ext="edit" rotation="t" aspectratio="t" verticies="t" text="t" shapetype="t"/>
+            <w10:anchorlock/>
+          </v:rect>
         </w:pict>
       </w:r>
     </w:p>
@@ -3328,13 +3361,8 @@
         </w:rPr>
       </w:pPr>
       <w:r>
-        <w:rPr>
-          <w:noProof/>
-        </w:rPr>
-      </w:r>
-      <w:r>
-        <w:pict w14:anchorId="545D93F8">
-          <v:rect id="Horizontal Line 4" o:spid="_x0000_s1026" style="width:468pt;height:1.1pt;visibility:visible;mso-wrap-style:square;mso-left-percent:-10001;mso-top-percent:-10001;mso-position-horizontal:absolute;mso-position-horizontal-relative:char;mso-position-vertical:absolute;mso-position-vertical-relative:line;mso-left-percent:-10001;mso-top-percent:-10001;v-text-anchor:top" o:gfxdata="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" filled="f">
+        <w:pict w14:anchorId="77A26210">
+          <v:rect id="Horizontal Line 4" o:spid="_x0000_s1026" alt="" style="width:468pt;height:1.1pt;visibility:visible;mso-wrap-style:square;mso-width-percent:0;mso-height-percent:0;mso-left-percent:-10001;mso-top-percent:-10001;mso-position-horizontal:absolute;mso-position-horizontal-relative:char;mso-position-vertical:absolute;mso-position-vertical-relative:line;mso-width-percent:0;mso-height-percent:0;mso-left-percent:-10001;mso-top-percent:-10001;v-text-anchor:top" filled="f">
             <o:lock v:ext="edit" rotation="t" aspectratio="t" verticies="t" text="t" shapetype="t"/>
             <w10:anchorlock/>
           </v:rect>
@@ -5346,10 +5374,7 @@
           </w:tcPr>
           <w:p>
             <w:r>
-              <w:t>Roughing</w:t>
-            </w:r>
-            <w:r>
-              <w:t xml:space="preserve"> Pump</w:t>
+              <w:t>Roughing Pump</w:t>
             </w:r>
           </w:p>
         </w:tc>
@@ -5413,13 +5438,7 @@
               <w:cnfStyle w:val="000000000000" w:firstRow="0" w:lastRow="0" w:firstColumn="0" w:lastColumn="0" w:oddVBand="0" w:evenVBand="0" w:oddHBand="0" w:evenHBand="0" w:firstRowFirstColumn="0" w:firstRowLastColumn="0" w:lastRowFirstColumn="0" w:lastRowLastColumn="0"/>
             </w:pPr>
             <w:r>
-              <w:t xml:space="preserve">Roughing pump </w:t>
-            </w:r>
-            <w:r>
-              <w:t xml:space="preserve">power </w:t>
-            </w:r>
-            <w:r>
-              <w:t>state.</w:t>
+              <w:t>Roughing pump power state.</w:t>
             </w:r>
           </w:p>
         </w:tc>
@@ -5506,25 +5525,7 @@
               <w:rPr>
                 <w:strike/>
               </w:rPr>
-              <w:t xml:space="preserve">(NOT APPLICALBLE) </w:t>
-            </w:r>
-            <w:r>
-              <w:rPr>
-                <w:strike/>
-              </w:rPr>
-              <w:t>Roughing pump 2</w:t>
-            </w:r>
-            <w:r>
-              <w:rPr>
-                <w:strike/>
-              </w:rPr>
-              <w:t xml:space="preserve"> power</w:t>
-            </w:r>
-            <w:r>
-              <w:rPr>
-                <w:strike/>
-              </w:rPr>
-              <w:t xml:space="preserve"> state.</w:t>
+              <w:t>(NOT APPLICALBLE) Roughing pump 2 power state.</w:t>
             </w:r>
           </w:p>
         </w:tc>
@@ -5608,25 +5609,7 @@
               <w:rPr>
                 <w:strike/>
               </w:rPr>
-              <w:t>(NOT APPLICALBLE)</w:t>
-            </w:r>
-            <w:r>
-              <w:rPr>
-                <w:strike/>
-              </w:rPr>
-              <w:t xml:space="preserve"> </w:t>
-            </w:r>
-            <w:r>
-              <w:rPr>
-                <w:strike/>
-              </w:rPr>
-              <w:t xml:space="preserve"> </w:t>
-            </w:r>
-            <w:r>
-              <w:rPr>
-                <w:strike/>
-              </w:rPr>
-              <w:t>Shared state for fan bank 1–4.</w:t>
+              <w:t>(NOT APPLICALBLE)  Shared state for fan bank 1–4.</w:t>
             </w:r>
           </w:p>
         </w:tc>
@@ -5713,13 +5696,7 @@
               <w:rPr>
                 <w:strike/>
               </w:rPr>
-              <w:t>(NOT APPLICALBLE)</w:t>
-            </w:r>
-            <w:r>
-              <w:rPr>
-                <w:strike/>
-              </w:rPr>
-              <w:t xml:space="preserve"> Auxiliary 24 V supply state.</w:t>
+              <w:t>(NOT APPLICALBLE) Auxiliary 24 V supply state.</w:t>
             </w:r>
           </w:p>
         </w:tc>

</xml_diff>